<commit_message>
fix: add cache-busting to markdown fetch
</commit_message>
<xml_diff>
--- a/Capitulo 1.docx
+++ b/Capitulo 1.docx
@@ -2,97 +2,6 @@
 <file path=word/document.xml><?xml version="1.0" encoding="utf-8"?>
 <w:document xmlns:wpc="http://schemas.microsoft.com/office/word/2010/wordprocessingCanvas" xmlns:cx="http://schemas.microsoft.com/office/drawing/2014/chartex" xmlns:cx1="http://schemas.microsoft.com/office/drawing/2015/9/8/chartex" xmlns:cx2="http://schemas.microsoft.com/office/drawing/2015/10/21/chartex" xmlns:cx3="http://schemas.microsoft.com/office/drawing/2016/5/9/chartex" xmlns:cx4="http://schemas.microsoft.com/office/drawing/2016/5/10/chartex" xmlns:cx5="http://schemas.microsoft.com/office/drawing/2016/5/11/chartex" xmlns:cx6="http://schemas.microsoft.com/office/drawing/2016/5/12/chartex" xmlns:cx7="http://schemas.microsoft.com/office/drawing/2016/5/13/chartex" xmlns:cx8="http://schemas.microsoft.com/office/drawing/2016/5/14/chartex" xmlns:mc="http://schemas.openxmlformats.org/markup-compatibility/2006" xmlns:aink="http://schemas.microsoft.com/office/drawing/2016/ink" xmlns:am3d="http://schemas.microsoft.com/office/drawing/2017/model3d" xmlns:o="urn:schemas-microsoft-com:office:office" xmlns:oel="http://schemas.microsoft.com/office/2019/extlst" xmlns:r="http://schemas.openxmlformats.org/officeDocument/2006/relationships" xmlns:m="http://schemas.openxmlformats.org/officeDocument/2006/math" xmlns:v="urn:schemas-microsoft-com:vml" xmlns:wp14="http://schemas.microsoft.com/office/word/2010/wordprocessingDrawing" xmlns:wp="http://schemas.openxmlformats.org/drawingml/2006/wordprocessingDrawing" xmlns:w10="urn:schemas-microsoft-com:office:word" xmlns:w="http://schemas.openxmlformats.org/wordprocessingml/2006/main" xmlns:w14="http://schemas.microsoft.com/office/word/2010/wordml" xmlns:w15="http://schemas.microsoft.com/office/word/2012/wordml" xmlns:w16cex="http://schemas.microsoft.com/office/word/2018/wordml/cex" xmlns:w16cid="http://schemas.microsoft.com/office/word/2016/wordml/cid" xmlns:w16="http://schemas.microsoft.com/office/word/2018/wordml" xmlns:w16du="http://schemas.microsoft.com/office/word/2023/wordml/word16du" xmlns:w16sdtdh="http://schemas.microsoft.com/office/word/2020/wordml/sdtdatahash" xmlns:w16sdtfl="http://schemas.microsoft.com/office/word/2024/wordml/sdtformatlock" xmlns:w16se="http://schemas.microsoft.com/office/word/2015/wordml/symex" xmlns:wpg="http://schemas.microsoft.com/office/word/2010/wordprocessingGroup" xmlns:wpi="http://schemas.microsoft.com/office/word/2010/wordprocessingInk" xmlns:wne="http://schemas.microsoft.com/office/word/2006/wordml" xmlns:wps="http://schemas.microsoft.com/office/word/2010/wordprocessingShape" mc:Ignorable="w14 w15 w16se w16cid w16 w16cex w16sdtdh w16sdtfl w16du wp14">
   <w:body>
-    <w:p>
-      <w:pPr>
-        <w:rPr>
-          <w:rStyle w:val="Hipervnculo"/>
-        </w:rPr>
-      </w:pPr>
-      <w:r>
-        <w:fldChar w:fldCharType="begin"/>
-      </w:r>
-      <w:r>
-        <w:instrText>HYPERLINK "https://alejandro8aperez.github.io/MARATONaide/index.html"</w:instrText>
-      </w:r>
-      <w:r>
-        <w:fldChar w:fldCharType="separate"/>
-      </w:r>
-    </w:p>
-    <w:p>
-      <w:pPr>
-        <w:rPr>
-          <w:rStyle w:val="Hipervnculo"/>
-          <w:b/>
-          <w:bCs/>
-        </w:rPr>
-      </w:pPr>
-      <w:r>
-        <w:rPr>
-          <w:rStyle w:val="Hipervnculo"/>
-          <w:b/>
-          <w:bCs/>
-        </w:rPr>
-        <w:t>M</w:t>
-      </w:r>
-    </w:p>
-    <w:p>
-      <w:proofErr w:type="spellStart"/>
-      <w:r>
-        <w:rPr>
-          <w:rStyle w:val="Hipervnculo"/>
-        </w:rPr>
-        <w:t>maraton</w:t>
-      </w:r>
-      <w:r>
-        <w:rPr>
-          <w:rStyle w:val="Hipervnculo"/>
-          <w:b/>
-          <w:bCs/>
-        </w:rPr>
-        <w:t>aide</w:t>
-      </w:r>
-      <w:proofErr w:type="spellEnd"/>
-      <w:r>
-        <w:fldChar w:fldCharType="end"/>
-      </w:r>
-    </w:p>
-    <w:p>
-      <w:pPr>
-        <w:numPr>
-          <w:ilvl w:val="0"/>
-          <w:numId w:val="2"/>
-        </w:numPr>
-      </w:pPr>
-      <w:hyperlink r:id="rId5" w:history="1">
-        <w:r>
-          <w:rPr>
-            <w:rStyle w:val="Hipervnculo"/>
-          </w:rPr>
-          <w:t>Inicio</w:t>
-        </w:r>
-      </w:hyperlink>
-    </w:p>
-    <w:p>
-      <w:pPr>
-        <w:numPr>
-          <w:ilvl w:val="0"/>
-          <w:numId w:val="2"/>
-        </w:numPr>
-      </w:pPr>
-      <w:hyperlink r:id="rId6" w:anchor="estructura" w:history="1">
-        <w:r>
-          <w:rPr>
-            <w:rStyle w:val="Hipervnculo"/>
-          </w:rPr>
-          <w:t>Estructura</w:t>
-        </w:r>
-      </w:hyperlink>
-    </w:p>
-    <w:p>
-      <w:r>
-        <w:t>Capítulo 0 · km 0–2</w:t>
-      </w:r>
-    </w:p>
     <w:p>
       <w:pPr>
         <w:rPr>
@@ -197,7 +106,6 @@
     </w:p>
     <w:p>
       <w:r>
-        <w:lastRenderedPageBreak/>
         <w:t xml:space="preserve">El aire de la mañana era frío, húmedo, con ese olor a tierra mojada que tienen las ciudades antes de que el sol las seque. Medellín todavía estaba dormida detrás de las ventanas cerradas, pero los cerros ya brillaban con la primera luz. </w:t>
       </w:r>
       <w:proofErr w:type="spellStart"/>
@@ -225,6 +133,7 @@
           <w:i/>
           <w:iCs/>
         </w:rPr>
+        <w:lastRenderedPageBreak/>
         <w:t>¿Por qué corro?</w:t>
       </w:r>
     </w:p>
@@ -299,169 +208,168 @@
     <w:p>
       <w:proofErr w:type="spellStart"/>
       <w:r>
+        <w:t>Runy</w:t>
+      </w:r>
+      <w:proofErr w:type="spellEnd"/>
+      <w:r>
+        <w:t xml:space="preserve"> asintió. </w:t>
+      </w:r>
+      <w:r>
+        <w:t xml:space="preserve">Es mejor comprar la inscripción. </w:t>
+      </w:r>
+      <w:r>
+        <w:t>No dijo más. El hombre tampoco. Corrieron juntos un rato, en silencio, como dos extraños que comparten un ascensor y deciden no hablar porque el silencio es más cómodo.</w:t>
+      </w:r>
+    </w:p>
+    <w:p>
+      <w:r>
+        <w:t>Después el hombre aceleró y desapareció entre la multitud</w:t>
+      </w:r>
+      <w:r>
+        <w:t xml:space="preserve"> esperando no ser notado por los administradores</w:t>
+      </w:r>
+      <w:r>
+        <w:t xml:space="preserve">. </w:t>
+      </w:r>
+      <w:proofErr w:type="spellStart"/>
+      <w:r>
+        <w:t>Runy</w:t>
+      </w:r>
+      <w:proofErr w:type="spellEnd"/>
+      <w:r>
+        <w:t xml:space="preserve"> no lo volvió a ver.</w:t>
+      </w:r>
+    </w:p>
+    <w:p>
+      <w:r>
+        <w:t xml:space="preserve">El kilómetro dos se acercaba. </w:t>
+      </w:r>
+      <w:proofErr w:type="spellStart"/>
+      <w:r>
+        <w:t>Runy</w:t>
+      </w:r>
+      <w:proofErr w:type="spellEnd"/>
+      <w:r>
+        <w:t xml:space="preserve"> lo sintió en las piernas, en la respiración que empezaba a pedir un ritmo más constante. El primer puesto de hidratación apareció a lo lejos, un grupo de voluntarios con mesas plegables y botellitas de agua alineados como soldados.</w:t>
+      </w:r>
+    </w:p>
+    <w:p>
+      <w:r>
         <w:lastRenderedPageBreak/>
+        <w:t xml:space="preserve">Y entonces, </w:t>
+      </w:r>
+      <w:r>
+        <w:t>en la colina del frente</w:t>
+      </w:r>
+      <w:r>
+        <w:t>, lo vio.</w:t>
+      </w:r>
+    </w:p>
+    <w:p>
+      <w:r>
+        <w:t xml:space="preserve">No esta vez entre las columnas de una plaza, sino </w:t>
+      </w:r>
+      <w:r>
+        <w:t>en la montaña</w:t>
+      </w:r>
+      <w:r>
+        <w:t>. Una figura inmóvil que no sudaba, que no jadeaba, que no llevaba dorsal ni ropa deportiva.</w:t>
+      </w:r>
+    </w:p>
+    <w:p>
+      <w:r>
+        <w:t>La misma capa oscura.</w:t>
+      </w:r>
+    </w:p>
+    <w:p>
+      <w:r>
+        <w:t xml:space="preserve">Pero esta vez la capa no </w:t>
+      </w:r>
+      <w:r>
+        <w:t xml:space="preserve">lo </w:t>
+      </w:r>
+      <w:r>
+        <w:t xml:space="preserve">cubría del todo. </w:t>
+      </w:r>
+      <w:proofErr w:type="spellStart"/>
+      <w:r>
         <w:t>Runy</w:t>
       </w:r>
       <w:proofErr w:type="spellEnd"/>
       <w:r>
-        <w:t xml:space="preserve"> asintió. </w:t>
-      </w:r>
-      <w:r>
-        <w:t xml:space="preserve">Es mejor comprar la inscripción. </w:t>
-      </w:r>
-      <w:r>
-        <w:t>No dijo más. El hombre tampoco. Corrieron juntos un rato, en silencio, como dos extraños que comparten un ascensor y deciden no hablar porque el silencio es más cómodo.</w:t>
-      </w:r>
-    </w:p>
-    <w:p>
-      <w:r>
-        <w:t>Después el hombre aceleró y desapareció entre la multitud</w:t>
-      </w:r>
-      <w:r>
-        <w:t xml:space="preserve"> esperando no ser notado por los administradores</w:t>
-      </w:r>
-      <w:r>
-        <w:t xml:space="preserve">. </w:t>
-      </w:r>
+        <w:t xml:space="preserve"> alcanzó a ver, por un instante, lo que la figura sostenía entre las manos: una varita oscura, delgada, que parecía hecha de la misma sombra que su capa. La punta brillaba tenue, como si contuviera una chispa que no necesitaba fuego para existir</w:t>
+      </w:r>
+      <w:r>
+        <w:t xml:space="preserve"> y en su otra mano una piedra dos veces mas grande que él.  </w:t>
+      </w:r>
+    </w:p>
+    <w:p>
       <w:proofErr w:type="spellStart"/>
       <w:r>
         <w:t>Runy</w:t>
       </w:r>
       <w:proofErr w:type="spellEnd"/>
       <w:r>
-        <w:t xml:space="preserve"> no lo volvió a ver.</w:t>
-      </w:r>
-    </w:p>
-    <w:p>
-      <w:r>
-        <w:t xml:space="preserve">El kilómetro dos se acercaba. </w:t>
+        <w:t xml:space="preserve"> parpadeó.</w:t>
+      </w:r>
+    </w:p>
+    <w:p>
+      <w:r>
+        <w:t>La figura seguía allí. La varita seguía en su man</w:t>
+      </w:r>
+      <w:r>
+        <w:t>o y la piedra empieza a girar hacia abajo</w:t>
+      </w:r>
+    </w:p>
+    <w:p>
+      <w:r>
+        <w:t xml:space="preserve">Pero cuando Runy volvió a mirar, después de esquivar a un corredor que frenó de golpe, ya no había nadie. Solo </w:t>
+      </w:r>
+      <w:r>
+        <w:t xml:space="preserve">la colina </w:t>
       </w:r>
       <w:proofErr w:type="spellStart"/>
       <w:r>
+        <w:t>vacia</w:t>
+      </w:r>
+      <w:proofErr w:type="spellEnd"/>
+      <w:r>
+        <w:t>. Solo el viento moviendo las hojas</w:t>
+      </w:r>
+      <w:r>
+        <w:t xml:space="preserve"> de los </w:t>
+      </w:r>
+      <w:proofErr w:type="spellStart"/>
+      <w:r>
+        <w:t>arboles</w:t>
+      </w:r>
+      <w:proofErr w:type="spellEnd"/>
+      <w:r>
+        <w:t>, indiferente.</w:t>
+      </w:r>
+    </w:p>
+    <w:p>
+      <w:r>
+        <w:t>—No puede ser —murmuró.</w:t>
+      </w:r>
+    </w:p>
+    <w:p>
+      <w:r>
+        <w:t>Pero sabía que sí. Sabía que lo había visto. Y sabía también que no podía detenerse a pensar en ello, porque el kilómetro dos estaba apareciendo a su lado, marcado por un letrero amarillo y un grupo de voluntarios que aplaudían sin saber por qué.</w:t>
+      </w:r>
+    </w:p>
+    <w:p>
+      <w:proofErr w:type="spellStart"/>
+      <w:r>
         <w:t>Runy</w:t>
       </w:r>
       <w:proofErr w:type="spellEnd"/>
       <w:r>
-        <w:t xml:space="preserve"> lo sintió en las piernas, en la respiración que empezaba a pedir un ritmo más constante. El primer puesto de hidratación apareció a lo lejos, un grupo de voluntarios con mesas plegables y botellitas de agua alineados como soldados.</w:t>
-      </w:r>
-    </w:p>
-    <w:p>
-      <w:r>
-        <w:t xml:space="preserve">Y entonces, </w:t>
-      </w:r>
-      <w:r>
-        <w:t>en la colina del frente</w:t>
-      </w:r>
-      <w:r>
-        <w:t>, lo vio.</w:t>
-      </w:r>
-    </w:p>
-    <w:p>
-      <w:r>
-        <w:t xml:space="preserve">No esta vez entre las columnas de una plaza, sino </w:t>
-      </w:r>
-      <w:r>
-        <w:t>en la montaña</w:t>
-      </w:r>
-      <w:r>
-        <w:t>. Una figura inmóvil que no sudaba, que no jadeaba, que no llevaba dorsal ni ropa deportiva.</w:t>
-      </w:r>
-    </w:p>
-    <w:p>
-      <w:r>
-        <w:t>La misma capa oscura.</w:t>
-      </w:r>
-    </w:p>
-    <w:p>
-      <w:r>
-        <w:t xml:space="preserve">Pero esta vez la capa no </w:t>
-      </w:r>
-      <w:r>
-        <w:t xml:space="preserve">lo </w:t>
-      </w:r>
-      <w:r>
-        <w:t xml:space="preserve">cubría del todo. </w:t>
-      </w:r>
-      <w:proofErr w:type="spellStart"/>
-      <w:r>
-        <w:t>Runy</w:t>
-      </w:r>
-      <w:proofErr w:type="spellEnd"/>
-      <w:r>
-        <w:t xml:space="preserve"> alcanzó a ver, por un instante, lo que la figura sostenía entre las manos: una varita oscura, delgada, que parecía hecha de la misma sombra que su capa. La punta brillaba tenue, como si contuviera una chispa que no necesitaba fuego para existir</w:t>
-      </w:r>
-      <w:r>
-        <w:t xml:space="preserve"> y en su otra mano una piedra dos veces mas grande que él.  </w:t>
-      </w:r>
-    </w:p>
-    <w:p>
-      <w:proofErr w:type="spellStart"/>
-      <w:r>
-        <w:t>Runy</w:t>
-      </w:r>
-      <w:proofErr w:type="spellEnd"/>
-      <w:r>
-        <w:t xml:space="preserve"> parpadeó.</w:t>
-      </w:r>
-    </w:p>
-    <w:p>
-      <w:r>
-        <w:t>La figura seguía allí. La varita seguía en su man</w:t>
-      </w:r>
-      <w:r>
-        <w:t>o y la piedra empieza a girar hacia abajo</w:t>
-      </w:r>
-    </w:p>
-    <w:p>
-      <w:r>
-        <w:t xml:space="preserve">Pero cuando Runy volvió a mirar, después de esquivar a un corredor que frenó de golpe, ya no había nadie. Solo </w:t>
-      </w:r>
-      <w:r>
-        <w:t xml:space="preserve">la colina </w:t>
-      </w:r>
-      <w:proofErr w:type="spellStart"/>
-      <w:r>
-        <w:t>vacia</w:t>
-      </w:r>
-      <w:proofErr w:type="spellEnd"/>
-      <w:r>
-        <w:t>. Solo el viento moviendo las hojas</w:t>
-      </w:r>
-      <w:r>
-        <w:t xml:space="preserve"> de los </w:t>
-      </w:r>
-      <w:proofErr w:type="spellStart"/>
-      <w:r>
-        <w:t>arboles</w:t>
-      </w:r>
-      <w:proofErr w:type="spellEnd"/>
-      <w:r>
-        <w:t>, indiferente.</w:t>
-      </w:r>
-    </w:p>
-    <w:p>
-      <w:r>
-        <w:t>—No puede ser —murmuró.</w:t>
-      </w:r>
-    </w:p>
-    <w:p>
-      <w:r>
-        <w:t>Pero sabía que sí. Sabía que lo había visto. Y sabía también que no podía detenerse a pensar en ello, porque el kilómetro dos estaba apareciendo a su lado, marcado por un letrero amarillo y un grupo de voluntarios que aplaudían sin saber por qué.</w:t>
-      </w:r>
-    </w:p>
-    <w:p>
-      <w:proofErr w:type="spellStart"/>
-      <w:r>
-        <w:t>Runy</w:t>
-      </w:r>
-      <w:proofErr w:type="spellEnd"/>
-      <w:r>
         <w:t xml:space="preserve"> agarró una botella de agua, bebió la mitad y se lanzó el resto en la cabeza. El agua le corrió por la frente, por el cuello, por la espalda. Se sentó un segundo en el borde de la acera, con las rodillas dobladas y el pecho subiendo y bajando.</w:t>
       </w:r>
     </w:p>
     <w:p>
       <w:r>
-        <w:lastRenderedPageBreak/>
         <w:t>La varita. La capa.</w:t>
       </w:r>
       <w:r>
@@ -1561,6 +1469,7 @@
   <w:style w:type="character" w:default="1" w:styleId="Fuentedeprrafopredeter">
     <w:name w:val="Default Paragraph Font"/>
     <w:uiPriority w:val="1"/>
+    <w:semiHidden/>
     <w:unhideWhenUsed/>
   </w:style>
   <w:style w:type="table" w:default="1" w:styleId="Tablanormal">

</xml_diff>